<commit_message>
Dodana QRZ poveznica i dokumentacija
</commit_message>
<xml_diff>
--- a/SmartAntenna Control/docs/Zavrsni_strucni_rad_SmartAntenna_Control.docx
+++ b/SmartAntenna Control/docs/Zavrsni_strucni_rad_SmartAntenna_Control.docx
@@ -84,7 +84,25 @@
           <w:sz w:val="56"/>
           <w:szCs w:val="56"/>
         </w:rPr>
-        <w:t xml:space="preserve"> Control – sustav za bežično upravljanje antenskim sustavima radioamatera</w:t>
+        <w:t xml:space="preserve"> Control – </w:t>
+      </w:r>
+      <w:proofErr w:type="spellStart"/>
+      <w:r>
+        <w:rPr>
+          <w:b/>
+          <w:sz w:val="56"/>
+          <w:szCs w:val="56"/>
+        </w:rPr>
+        <w:t>sustav</w:t>
+      </w:r>
+      <w:proofErr w:type="spellEnd"/>
+      <w:r>
+        <w:rPr>
+          <w:b/>
+          <w:sz w:val="56"/>
+          <w:szCs w:val="56"/>
+        </w:rPr>
+        <w:t xml:space="preserve"> za bežično upravljanje antenskim sustavima radioamatera</w:t>
       </w:r>
     </w:p>
     <w:p>
@@ -1269,6 +1287,7 @@
     </w:p>
     <w:p>
       <w:pPr>
+        <w:ind w:firstLine="567"/>
         <w:rPr>
           <w:lang w:val="hr-HR"/>
         </w:rPr>
@@ -1412,6 +1431,9 @@
       <w:bookmarkEnd w:id="4"/>
     </w:p>
     <w:p>
+      <w:pPr>
+        <w:ind w:firstLine="567"/>
+      </w:pPr>
       <w:r>
         <w:t xml:space="preserve">ESP8266 </w:t>
       </w:r>
@@ -1745,6 +1767,7 @@
     </w:p>
     <w:p>
       <w:pPr>
+        <w:ind w:firstLine="567"/>
         <w:rPr>
           <w:lang w:val="hr-HR"/>
         </w:rPr>
@@ -1907,6 +1930,9 @@
       </w:r>
     </w:p>
     <w:p>
+      <w:pPr>
+        <w:ind w:firstLine="567"/>
+      </w:pPr>
       <w:r>
         <w:t xml:space="preserve">Za </w:t>
       </w:r>
@@ -2218,10 +2244,43 @@
     <w:p>
       <w:pPr>
         <w:spacing w:line="360" w:lineRule="auto"/>
+        <w:ind w:firstLine="567"/>
         <w:jc w:val="both"/>
       </w:pPr>
       <w:r>
-        <w:t>Sustav koristi HTTP protokol za komunikaciju između korisničkog sučelja (Frontend) i kontrolera (Backend). Web sučelje je izrađeno pomoću HTML5, CSS3 i JavaScript tehnologija, koristeći Grid i Flexbox rasporede za responzivnost na mobilnim uređajima.</w:t>
+        <w:t xml:space="preserve">Sustav koristi HTTP protokol za komunikaciju između korisničkog sučelja (Frontend) i kontrolera (Backend). Web sučelje je izrađeno pomoću HTML5, CSS3 i JavaScript tehnologija, koristeći Grid i Flexbox rasporede za </w:t>
+      </w:r>
+      <w:proofErr w:type="spellStart"/>
+      <w:r>
+        <w:t>responzivnost</w:t>
+      </w:r>
+      <w:proofErr w:type="spellEnd"/>
+      <w:r>
+        <w:t xml:space="preserve"> </w:t>
+      </w:r>
+      <w:proofErr w:type="spellStart"/>
+      <w:r>
+        <w:t>na</w:t>
+      </w:r>
+      <w:proofErr w:type="spellEnd"/>
+      <w:r>
+        <w:t xml:space="preserve"> </w:t>
+      </w:r>
+      <w:proofErr w:type="spellStart"/>
+      <w:r>
+        <w:t>mobilnim</w:t>
+      </w:r>
+      <w:proofErr w:type="spellEnd"/>
+      <w:r>
+        <w:t xml:space="preserve"> </w:t>
+      </w:r>
+      <w:proofErr w:type="spellStart"/>
+      <w:r>
+        <w:t>uređajima</w:t>
+      </w:r>
+      <w:proofErr w:type="spellEnd"/>
+      <w:r>
+        <w:t>.</w:t>
       </w:r>
     </w:p>
     <w:p>
@@ -2230,13 +2289,35 @@
       </w:pPr>
       <w:bookmarkStart w:id="9" w:name="_Toc217223091"/>
       <w:r>
-        <w:t>3.2. Upravljanje koračnim motorom</w:t>
+        <w:t xml:space="preserve">3.2. </w:t>
+      </w:r>
+      <w:proofErr w:type="spellStart"/>
+      <w:r>
+        <w:t>Upravljanje</w:t>
+      </w:r>
+      <w:proofErr w:type="spellEnd"/>
+      <w:r>
+        <w:t xml:space="preserve"> </w:t>
+      </w:r>
+      <w:proofErr w:type="spellStart"/>
+      <w:r>
+        <w:t>koračnim</w:t>
+      </w:r>
+      <w:proofErr w:type="spellEnd"/>
+      <w:r>
+        <w:t xml:space="preserve"> </w:t>
+      </w:r>
+      <w:proofErr w:type="spellStart"/>
+      <w:r>
+        <w:t>motorom</w:t>
       </w:r>
       <w:bookmarkEnd w:id="9"/>
+      <w:proofErr w:type="spellEnd"/>
     </w:p>
     <w:p>
       <w:pPr>
         <w:spacing w:line="360" w:lineRule="auto"/>
+        <w:ind w:firstLine="567"/>
         <w:jc w:val="both"/>
       </w:pPr>
       <w:r>
@@ -2248,7 +2329,31 @@
       </w:r>
       <w:proofErr w:type="gramEnd"/>
       <w:r>
-        <w:t xml:space="preserve"> ULN2003. JavaScript šalje kutne koordinate (0–359°) putem API rute, dok C++ kod na ESP8266 izračunava potreban broj </w:t>
+        <w:t xml:space="preserve"> ULN2003. JavaScript šalje kutne koordinate (0–359°) putem API rute, dok C++ kod na ESP8266 </w:t>
+      </w:r>
+      <w:proofErr w:type="spellStart"/>
+      <w:r>
+        <w:t>izračunava</w:t>
+      </w:r>
+      <w:proofErr w:type="spellEnd"/>
+      <w:r>
+        <w:t xml:space="preserve"> </w:t>
+      </w:r>
+      <w:proofErr w:type="spellStart"/>
+      <w:r>
+        <w:t>potreban</w:t>
+      </w:r>
+      <w:proofErr w:type="spellEnd"/>
+      <w:r>
+        <w:t xml:space="preserve"> </w:t>
+      </w:r>
+      <w:proofErr w:type="spellStart"/>
+      <w:r>
+        <w:t>broj</w:t>
+      </w:r>
+      <w:proofErr w:type="spellEnd"/>
+      <w:r>
+        <w:t xml:space="preserve"> </w:t>
       </w:r>
       <w:proofErr w:type="spellStart"/>
       <w:r>
@@ -2314,6 +2419,7 @@
     <w:p>
       <w:pPr>
         <w:spacing w:line="360" w:lineRule="auto"/>
+        <w:ind w:firstLine="567"/>
         <w:jc w:val="both"/>
         <w:rPr>
           <w:lang w:val="hr-HR"/>
@@ -2476,6 +2582,9 @@
       </w:r>
     </w:p>
     <w:p>
+      <w:pPr>
+        <w:ind w:firstLine="567"/>
+      </w:pPr>
       <w:proofErr w:type="spellStart"/>
       <w:r>
         <w:rPr>
@@ -3076,6 +3185,7 @@
     </w:p>
     <w:p>
       <w:pPr>
+        <w:ind w:firstLine="567"/>
         <w:rPr>
           <w:lang w:val="hr-HR"/>
         </w:rPr>
@@ -4927,6 +5037,7 @@
   <w:style w:type="character" w:default="1" w:styleId="DefaultParagraphFont">
     <w:name w:val="Default Paragraph Font"/>
     <w:uiPriority w:val="1"/>
+    <w:semiHidden/>
     <w:unhideWhenUsed/>
   </w:style>
   <w:style w:type="table" w:default="1" w:styleId="TableNormal">

</xml_diff>